<commit_message>
Manual de usuario 2.0 para Total Clean Car
Reescrito para la version actual: roles, reserva en seis pasos, precios
por tipo de vehiculo, adicionales, pagos, lavador, panel y app Android.
13 capturas nuevas con datos de demostracion; PDF y DOCX generados con
los scripts de /usr/local/share/auditoria. Indice e historial de
versiones actualizados.

Co-Authored-By: Claude Opus 5.5 (1M context) <noreply@anthropic.com>
</commit_message>
<xml_diff>
--- a/docs/14_GESTION/Historial_Versiones.docx
+++ b/docs/14_GESTION/Historial_Versiones.docx
@@ -27,7 +27,19 @@
         <w:pStyle w:val="Subtitle"/>
       </w:pPr>
       <w:r>
-        <w:t xml:space="preserve">LavadoCarros</w:t>
+        <w:t xml:space="preserve">Total</w:t>
+      </w:r>
+      <w:r>
+        <w:t xml:space="preserve"> </w:t>
+      </w:r>
+      <w:r>
+        <w:t xml:space="preserve">Clean</w:t>
+      </w:r>
+      <w:r>
+        <w:t xml:space="preserve"> </w:t>
+      </w:r>
+      <w:r>
+        <w:t xml:space="preserve">Car</w:t>
       </w:r>
     </w:p>
     <w:p>
@@ -79,7 +91,7 @@
         <w:t xml:space="preserve"> </w:t>
       </w:r>
       <w:r>
-        <w:t xml:space="preserve">1.0</w:t>
+        <w:t xml:space="preserve">2.0</w:t>
       </w:r>
       <w:r>
         <w:t xml:space="preserve"> </w:t>
@@ -91,7 +103,7 @@
         <w:t xml:space="preserve"> </w:t>
       </w:r>
       <w:r>
-        <w:t xml:space="preserve">15</w:t>
+        <w:t xml:space="preserve">27</w:t>
       </w:r>
       <w:r>
         <w:t xml:space="preserve"> </w:t>
@@ -279,6 +291,77 @@
           </w:p>
         </w:tc>
       </w:tr>
+      <w:tr>
+        <w:tc>
+          <w:tcPr/>
+          <w:p>
+            <w:pPr>
+              <w:pStyle w:val="Compact"/>
+              <w:jc w:val="left"/>
+            </w:pPr>
+            <w:r>
+              <w:t xml:space="preserve">2.0</w:t>
+            </w:r>
+          </w:p>
+        </w:tc>
+        <w:tc>
+          <w:tcPr/>
+          <w:p>
+            <w:pPr>
+              <w:pStyle w:val="Compact"/>
+              <w:jc w:val="left"/>
+            </w:pPr>
+            <w:r>
+              <w:t xml:space="preserve">2026-09-27</w:t>
+            </w:r>
+          </w:p>
+        </w:tc>
+        <w:tc>
+          <w:tcPr/>
+          <w:p>
+            <w:pPr>
+              <w:pStyle w:val="Compact"/>
+              <w:jc w:val="left"/>
+            </w:pPr>
+            <w:r>
+              <w:rPr>
+                <w:rStyle w:val="VerbatimChar"/>
+              </w:rPr>
+              <w:t xml:space="preserve">07_MANUAL_USUARIO</w:t>
+            </w:r>
+            <w:r>
+              <w:t xml:space="preserve"> </w:t>
+            </w:r>
+            <w:r>
+              <w:t xml:space="preserve">reescrito para Total Clean Car: roles, reserva en seis pasos, precios por tipo de vehiculo, adicionales, app Android; 13 capturas nuevas (solo datos de demostracion). Nuevo</w:t>
+            </w:r>
+            <w:r>
+              <w:t xml:space="preserve"> </w:t>
+            </w:r>
+            <w:r>
+              <w:rPr>
+                <w:rStyle w:val="VerbatimChar"/>
+              </w:rPr>
+              <w:t xml:space="preserve">15_APK/Preparacion_APK.md</w:t>
+            </w:r>
+            <w:r>
+              <w:t xml:space="preserve">. Copia editable en linea enlazada desde el manual.</w:t>
+            </w:r>
+          </w:p>
+        </w:tc>
+        <w:tc>
+          <w:tcPr/>
+          <w:p>
+            <w:pPr>
+              <w:pStyle w:val="Compact"/>
+              <w:jc w:val="left"/>
+            </w:pPr>
+            <w:r>
+              <w:t xml:space="preserve">Desarrollo</w:t>
+            </w:r>
+          </w:p>
+        </w:tc>
+      </w:tr>
     </w:tbl>
     <w:bookmarkEnd w:id="20"/>
     <w:bookmarkStart w:id="21" w:name="aplicacion"/>
@@ -370,6 +453,110 @@
               <w:jc w:val="left"/>
             </w:pPr>
             <w:r>
+              <w:t xml:space="preserve">2026-09-27</w:t>
+            </w:r>
+          </w:p>
+        </w:tc>
+        <w:tc>
+          <w:tcPr/>
+          <w:p>
+            <w:pPr>
+              <w:pStyle w:val="Compact"/>
+              <w:jc w:val="left"/>
+            </w:pPr>
+            <w:r>
+              <w:rPr>
+                <w:rStyle w:val="VerbatimChar"/>
+              </w:rPr>
+              <w:t xml:space="preserve">11d0ea2</w:t>
+            </w:r>
+          </w:p>
+        </w:tc>
+        <w:tc>
+          <w:tcPr/>
+          <w:p>
+            <w:pPr>
+              <w:pStyle w:val="Compact"/>
+              <w:jc w:val="left"/>
+            </w:pPr>
+            <w:r>
+              <w:t xml:space="preserve">APK: admin y operador arrancan en la Agenda en el celular</w:t>
+            </w:r>
+          </w:p>
+        </w:tc>
+      </w:tr>
+      <w:tr>
+        <w:tc>
+          <w:tcPr/>
+          <w:p>
+            <w:pPr>
+              <w:pStyle w:val="Compact"/>
+              <w:jc w:val="left"/>
+            </w:pPr>
+            <w:r>
+              <w:t xml:space="preserve">2026-09-27</w:t>
+            </w:r>
+          </w:p>
+        </w:tc>
+        <w:tc>
+          <w:tcPr/>
+          <w:p>
+            <w:pPr>
+              <w:pStyle w:val="Compact"/>
+              <w:jc w:val="left"/>
+            </w:pPr>
+            <w:r>
+              <w:rPr>
+                <w:rStyle w:val="VerbatimChar"/>
+              </w:rPr>
+              <w:t xml:space="preserve">6cb9513</w:t>
+            </w:r>
+          </w:p>
+        </w:tc>
+        <w:tc>
+          <w:tcPr/>
+          <w:p>
+            <w:pPr>
+              <w:pStyle w:val="Compact"/>
+              <w:jc w:val="left"/>
+            </w:pPr>
+            <w:r>
+              <w:rPr>
+                <w:b/>
+                <w:bCs/>
+              </w:rPr>
+              <w:t xml:space="preserve">Total Clean Car:</w:t>
+            </w:r>
+            <w:r>
+              <w:t xml:space="preserve"> </w:t>
+            </w:r>
+            <w:r>
+              <w:t xml:space="preserve">precios por tipo de vehiculo, adicionales, correccion de fechas, sesion y preparacion de la APK (ver</w:t>
+            </w:r>
+            <w:r>
+              <w:t xml:space="preserve"> </w:t>
+            </w:r>
+            <w:r>
+              <w:rPr>
+                <w:rStyle w:val="VerbatimChar"/>
+              </w:rPr>
+              <w:t xml:space="preserve">CHANGELOG.md</w:t>
+            </w:r>
+            <w:r>
+              <w:t xml:space="preserve">)</w:t>
+            </w:r>
+          </w:p>
+        </w:tc>
+      </w:tr>
+      <w:tr>
+        <w:tc>
+          <w:tcPr/>
+          <w:p>
+            <w:pPr>
+              <w:pStyle w:val="Compact"/>
+              <w:jc w:val="left"/>
+            </w:pPr>
+            <w:r>
               <w:t xml:space="preserve">2026-08-31</w:t>
             </w:r>
           </w:p>
@@ -706,8 +893,9 @@
     <w:tbl>
       <w:tblPr>
         <w:tblStyle w:val="Table"/>
-        <w:tblW w:type="auto" w:w="0"/>
+        <w:tblW w:type="pct" w:w="5000"/>
         <w:jc w:val="left"/>
+        <w:tblLayout w:type="fixed"/>
         <w:tblLook w:firstRow="0" w:lastRow="0" w:firstColumn="0" w:lastColumn="0" w:noHBand="0" w:noVBand="0" w:val="0000"/>
       </w:tblPr>
       <w:tblGrid>
@@ -767,7 +955,7 @@
               <w:rPr>
                 <w:rStyle w:val="VerbatimChar"/>
               </w:rPr>
-              <w:t xml:space="preserve">master</w:t>
+              <w:t xml:space="preserve">main</w:t>
             </w:r>
           </w:p>
         </w:tc>
@@ -793,7 +981,7 @@
               <w:jc w:val="left"/>
             </w:pPr>
             <w:r>
-              <w:t xml:space="preserve">2026-08-31</w:t>
+              <w:t xml:space="preserve">2026-09-27</w:t>
             </w:r>
           </w:p>
         </w:tc>
@@ -820,10 +1008,15 @@
             </w:pPr>
             <w:r>
               <w:rPr>
-                <w:b/>
-                <w:bCs/>
+                <w:rStyle w:val="VerbatimChar"/>
               </w:rPr>
-              <w:t xml:space="preserve">ninguno configurado</w:t>
+              <w:t xml:space="preserve">megaman0012/lavado_de_carros</w:t>
+            </w:r>
+            <w:r>
+              <w:t xml:space="preserve"> </w:t>
+            </w:r>
+            <w:r>
+              <w:t xml:space="preserve">en GitHub (actualizado el 2026-09-27)</w:t>
             </w:r>
           </w:p>
         </w:tc>
@@ -834,35 +1027,13 @@
         <w:pStyle w:val="BodyText"/>
       </w:pPr>
       <w:r>
-        <w:rPr>
-          <w:b/>
-          <w:bCs/>
-        </w:rPr>
-        <w:t xml:space="preserve">Dos semanas sin cambios</w:t>
+        <w:t xml:space="preserve">Al momento de la auditoria (2026-09-15) no habia remoto configurado; el riesgo de</w:t>
       </w:r>
       <w:r>
         <w:t xml:space="preserve"> </w:t>
       </w:r>
       <w:r>
-        <w:t xml:space="preserve">al momento de la auditoria.</w:t>
-      </w:r>
-    </w:p>
-    <w:p>
-      <w:pPr>
-        <w:pStyle w:val="BodyText"/>
-      </w:pPr>
-      <w:r>
-        <w:rPr>
-          <w:b/>
-          <w:bCs/>
-        </w:rPr>
-        <w:t xml:space="preserve">Riesgo de gestion:</w:t>
-      </w:r>
-      <w:r>
-        <w:t xml:space="preserve"> </w:t>
-      </w:r>
-      <w:r>
-        <w:t xml:space="preserve">sin remoto, el codigo existe solo en este servidor.</w:t>
+        <w:t xml:space="preserve">que el codigo existiera solo en este servidor quedo resuelto.</w:t>
       </w:r>
     </w:p>
     <w:bookmarkEnd w:id="22"/>
@@ -1000,19 +1171,19 @@
               <w:jc w:val="left"/>
             </w:pPr>
             <w:r>
-              <w:t xml:space="preserve">1.0</w:t>
-            </w:r>
-          </w:p>
-        </w:tc>
-        <w:tc>
-          <w:tcPr/>
-          <w:p>
-            <w:pPr>
-              <w:pStyle w:val="Compact"/>
-              <w:jc w:val="left"/>
-            </w:pPr>
-            <w:r>
-              <w:t xml:space="preserve">2026-09-15</w:t>
+              <w:t xml:space="preserve">2.0</w:t>
+            </w:r>
+          </w:p>
+        </w:tc>
+        <w:tc>
+          <w:tcPr/>
+          <w:p>
+            <w:pPr>
+              <w:pStyle w:val="Compact"/>
+              <w:jc w:val="left"/>
+            </w:pPr>
+            <w:r>
+              <w:t xml:space="preserve">2026-09-27</w:t>
             </w:r>
           </w:p>
         </w:tc>

</xml_diff>

<commit_message>
Manual de administrador 2.0 para Total Clean Car
Precios por tipo de vehiculo, adicionales, reglas de cupos, zona horaria,
APP_TZ y CORS_ORIGINS, procedimiento de despliegue y migraciones, APK y
respaldo. Corrige tres rutas de API de la v1.0 que no existian.
PDF y DOCX generados con los scripts de /usr/local/share/auditoria;
indice e historial de versiones actualizados.

Co-Authored-By: Claude Opus 5.5 (1M context) <noreply@anthropic.com>
</commit_message>
<xml_diff>
--- a/docs/14_GESTION/Historial_Versiones.docx
+++ b/docs/14_GESTION/Historial_Versiones.docx
@@ -91,7 +91,7 @@
         <w:t xml:space="preserve"> </w:t>
       </w:r>
       <w:r>
-        <w:t xml:space="preserve">2.0</w:t>
+        <w:t xml:space="preserve">2.1</w:t>
       </w:r>
       <w:r>
         <w:t xml:space="preserve"> </w:t>
@@ -362,6 +362,92 @@
           </w:p>
         </w:tc>
       </w:tr>
+      <w:tr>
+        <w:tc>
+          <w:tcPr/>
+          <w:p>
+            <w:pPr>
+              <w:pStyle w:val="Compact"/>
+              <w:jc w:val="left"/>
+            </w:pPr>
+            <w:r>
+              <w:t xml:space="preserve">2.1</w:t>
+            </w:r>
+          </w:p>
+        </w:tc>
+        <w:tc>
+          <w:tcPr/>
+          <w:p>
+            <w:pPr>
+              <w:pStyle w:val="Compact"/>
+              <w:jc w:val="left"/>
+            </w:pPr>
+            <w:r>
+              <w:t xml:space="preserve">2026-09-27</w:t>
+            </w:r>
+          </w:p>
+        </w:tc>
+        <w:tc>
+          <w:tcPr/>
+          <w:p>
+            <w:pPr>
+              <w:pStyle w:val="Compact"/>
+              <w:jc w:val="left"/>
+            </w:pPr>
+            <w:r>
+              <w:rPr>
+                <w:rStyle w:val="VerbatimChar"/>
+              </w:rPr>
+              <w:t xml:space="preserve">08_MANUAL_ADMINISTRADOR</w:t>
+            </w:r>
+            <w:r>
+              <w:t xml:space="preserve"> </w:t>
+            </w:r>
+            <w:r>
+              <w:t xml:space="preserve">v2.0: precios por tipo de vehiculo, adicionales, reglas de cupos, zona horaria, parametros</w:t>
+            </w:r>
+            <w:r>
+              <w:t xml:space="preserve"> </w:t>
+            </w:r>
+            <w:r>
+              <w:rPr>
+                <w:rStyle w:val="VerbatimChar"/>
+              </w:rPr>
+              <w:t xml:space="preserve">APP_TZ</w:t>
+            </w:r>
+            <w:r>
+              <w:t xml:space="preserve"> </w:t>
+            </w:r>
+            <w:r>
+              <w:t xml:space="preserve">y</w:t>
+            </w:r>
+            <w:r>
+              <w:t xml:space="preserve"> </w:t>
+            </w:r>
+            <w:r>
+              <w:rPr>
+                <w:rStyle w:val="VerbatimChar"/>
+              </w:rPr>
+              <w:t xml:space="preserve">CORS_ORIGINS</w:t>
+            </w:r>
+            <w:r>
+              <w:t xml:space="preserve">, procedimiento de despliegue y migraciones, APK y respaldo. Corrige tres rutas de API de la v1.0 que no existian (reinicio de credenciales, acta, asignar lavador).</w:t>
+            </w:r>
+          </w:p>
+        </w:tc>
+        <w:tc>
+          <w:tcPr/>
+          <w:p>
+            <w:pPr>
+              <w:pStyle w:val="Compact"/>
+              <w:jc w:val="left"/>
+            </w:pPr>
+            <w:r>
+              <w:t xml:space="preserve">Desarrollo</w:t>
+            </w:r>
+          </w:p>
+        </w:tc>
+      </w:tr>
     </w:tbl>
     <w:bookmarkEnd w:id="20"/>
     <w:bookmarkStart w:id="21" w:name="aplicacion"/>
@@ -1171,7 +1257,7 @@
               <w:jc w:val="left"/>
             </w:pPr>
             <w:r>
-              <w:t xml:space="preserve">2.0</w:t>
+              <w:t xml:space="preserve">2.1</w:t>
             </w:r>
           </w:p>
         </w:tc>

</xml_diff>